<commit_message>
Add mockup screenshots to Exp 3 and 4
Co-Authored-By: Claude Sonnet 5.5 <noreply@anthropic.com>
Claude-Session: https://claude.ai/code/session_01K7NyCBZ8oopMyp9QYPCuSk
</commit_message>
<xml_diff>
--- a/DT_Lab_Solved/EXP_3_DT_Krishang_B106.docx
+++ b/DT_Lab_Solved/EXP_3_DT_Krishang_B106.docx
@@ -2561,17 +2561,112 @@
     </w:p>
     <w:p>
       <w:pPr>
+        <w:jc w:val="center"/>
+      </w:pPr>
+      <w:r>
+        <w:drawing>
+          <wp:inline xmlns:a="http://schemas.openxmlformats.org/drawingml/2006/main" xmlns:pic="http://schemas.openxmlformats.org/drawingml/2006/picture">
+            <wp:extent cx="5120640" cy="3186176"/>
+            <wp:docPr id="1" name="Picture 1"/>
+            <wp:cNvGraphicFramePr>
+              <a:graphicFrameLocks noChangeAspect="1"/>
+            </wp:cNvGraphicFramePr>
+            <a:graphic>
+              <a:graphicData uri="http://schemas.openxmlformats.org/drawingml/2006/picture">
+                <pic:pic>
+                  <pic:nvPicPr>
+                    <pic:cNvPr id="0" name="e3_flightplan.png"/>
+                    <pic:cNvPicPr/>
+                  </pic:nvPicPr>
+                  <pic:blipFill>
+                    <a:blip r:embed="rId13"/>
+                    <a:stretch>
+                      <a:fillRect/>
+                    </a:stretch>
+                  </pic:blipFill>
+                  <pic:spPr>
+                    <a:xfrm>
+                      <a:off x="0" y="0"/>
+                      <a:ext cx="5120640" cy="3186176"/>
+                    </a:xfrm>
+                    <a:prstGeom prst="rect"/>
+                  </pic:spPr>
+                </pic:pic>
+              </a:graphicData>
+            </a:graphic>
+          </wp:inline>
+        </w:drawing>
+      </w:r>
+    </w:p>
+    <w:p>
+      <w:pPr>
         <w:spacing w:after="120" w:before="0"/>
+        <w:jc w:val="center"/>
       </w:pPr>
       <w:r>
         <w:rPr>
           <w:rFonts w:ascii="Times New Roman" w:hAnsi="Times New Roman" w:cs="Times New Roman"/>
           <w:b w:val="0"/>
           <w:i/>
-          <w:sz w:val="24"/>
+          <w:sz w:val="20"/>
           <w:u w:val="none"/>
         </w:rPr>
-        <w:t>[Paste screenshots here: (a) Mission Planner main screen, (b) Flight Plan tab with waypoints, (c) Write WPs success, (d) Flight Data tab in AUTO mode]</w:t>
+        <w:t>Fig. 1 (mockup): Flight Plan tab – waypoints, RTL and Write WPs</w:t>
+      </w:r>
+    </w:p>
+    <w:p>
+      <w:pPr>
+        <w:jc w:val="center"/>
+      </w:pPr>
+      <w:r>
+        <w:drawing>
+          <wp:inline xmlns:a="http://schemas.openxmlformats.org/drawingml/2006/main" xmlns:pic="http://schemas.openxmlformats.org/drawingml/2006/picture">
+            <wp:extent cx="5120640" cy="2389632"/>
+            <wp:docPr id="2" name="Picture 2"/>
+            <wp:cNvGraphicFramePr>
+              <a:graphicFrameLocks noChangeAspect="1"/>
+            </wp:cNvGraphicFramePr>
+            <a:graphic>
+              <a:graphicData uri="http://schemas.openxmlformats.org/drawingml/2006/picture">
+                <pic:pic>
+                  <pic:nvPicPr>
+                    <pic:cNvPr id="0" name="e3_flightdata.png"/>
+                    <pic:cNvPicPr/>
+                  </pic:nvPicPr>
+                  <pic:blipFill>
+                    <a:blip r:embed="rId14"/>
+                    <a:stretch>
+                      <a:fillRect/>
+                    </a:stretch>
+                  </pic:blipFill>
+                  <pic:spPr>
+                    <a:xfrm>
+                      <a:off x="0" y="0"/>
+                      <a:ext cx="5120640" cy="2389632"/>
+                    </a:xfrm>
+                    <a:prstGeom prst="rect"/>
+                  </pic:spPr>
+                </pic:pic>
+              </a:graphicData>
+            </a:graphic>
+          </wp:inline>
+        </w:drawing>
+      </w:r>
+    </w:p>
+    <w:p>
+      <w:pPr>
+        <w:spacing w:after="120" w:before="0"/>
+        <w:jc w:val="center"/>
+      </w:pPr>
+      <w:r>
+        <w:rPr>
+          <w:rFonts w:ascii="Times New Roman" w:hAnsi="Times New Roman" w:cs="Times New Roman"/>
+          <w:b w:val="0"/>
+          <w:i/>
+          <w:sz w:val="20"/>
+          <w:u w:val="none"/>
+        </w:rPr>
+        <w:t>Fig. 2 (mockup): Flight Data tab – mission executing in AUTO mode</w:t>
       </w:r>
     </w:p>
     <w:p>

</xml_diff>